<commit_message>
Slide Bài 5, 6, 7 – Toán 11 làm lại bằng skill slide-tu-khbd: đủ đề bài, lời giải chi tiết từng bước; KHBD Bài 7 dựng lại theo Phụ lục 1
Co-Authored-By: Claude Opus 5.5 <noreply@anthropic.com>
</commit_message>
<xml_diff>
--- a/giao_an/KHBD_TOAN11_Bai7_T15-16.docx
+++ b/giao_an/KHBD_TOAN11_Bai7_T15-16.docx
@@ -707,7 +707,7 @@
           <w:b/>
           <w:sz w:val="26"/>
         </w:rPr>
-        <w:t>1.3.NC1a – Quản lý dữ liệu, thông tin và nội dung số:</w:t>
+        <w:t>1.2.NC1a – Đánh giá dữ liệu, thông tin và nội dung số:</w:t>
       </w:r>
       <w:r>
         <w:rPr>
@@ -827,14 +827,14 @@
           <w:b/>
           <w:sz w:val="26"/>
         </w:rPr>
-        <w:t xml:space="preserve">5.2.NC1b; 2.5.NC1a – Củng cố, luyện tập bài học trên môi trường số; an toàn, trung thực khi làm bài trực tuyến: </w:t>
-      </w:r>
-      <w:r>
-        <w:rPr>
-          <w:rFonts w:ascii="Times New Roman" w:hAnsi="Times New Roman" w:eastAsia="Times New Roman"/>
-          <w:sz w:val="26"/>
-        </w:rPr>
-        <w:t xml:space="preserve">Sử dụng hệ thống luyện tập trực tuyến do giáo viên/tổ chuyên môn tổ chức để củng cố nội dung bài học, nhận phản hồi và tự đánh giá kết quả; thực hiện đúng quy tắc an toàn, bảo mật và trung thực trong môi trường số. (Củng cố – bài luyện tập trên hệ thống Taode_thi_online.)</w:t>
+        <w:t>5.2.NC1b; 2.5.NC1a – Củng cố, luyện tập bài học trên môi trường số; an toàn, trung thực khi làm bài trực tuyến:</w:t>
+      </w:r>
+      <w:r>
+        <w:rPr>
+          <w:rFonts w:ascii="Times New Roman" w:hAnsi="Times New Roman" w:eastAsia="Times New Roman"/>
+          <w:sz w:val="26"/>
+        </w:rPr>
+        <w:t xml:space="preserve"> Sử dụng hệ thống luyện tập trực tuyến do giáo viên/tổ chuyên môn tổ chức để củng cố nội dung bài học, nhận phản hồi và tự đánh giá kết quả; thực hiện đúng quy tắc an toàn, bảo mật và trung thực trong môi trường số. (Củng cố – bài luyện tập trên hệ thống Taode_thi_online.)</w:t>
       </w:r>
     </w:p>
     <w:p>
@@ -9836,14 +9836,7 @@
           <w:rFonts w:ascii="Times New Roman" w:hAnsi="Times New Roman" w:eastAsia="Times New Roman"/>
           <w:sz w:val="26"/>
         </w:rPr>
-        <w:t xml:space="preserve"> HS hệ thống lại kiến thức của bài bằng sơ đồ tư duy; tự đánh giá mức độ đạt yêu cầu cần đạt qua câu hỏi trắc nghiệm; biết bài học của tiết sau.</w:t>
-      </w:r>
-      <w:r>
-        <w:rPr>
-          <w:rFonts w:ascii="Times New Roman" w:hAnsi="Times New Roman" w:eastAsia="Times New Roman"/>
-          <w:sz w:val="26"/>
-        </w:rPr>
-        <w:t xml:space="preserve"> Sử dụng hệ thống luyện tập trực tuyến do giáo viên/tổ chuyên môn tổ chức để củng cố nội dung bài học, nhận phản hồi và tự đánh giá kết quả; thực hiện đúng quy tắc an toàn, bảo mật và trung thực trong môi trường số (5.2.NC1b; 2.5.NC1a).</w:t>
+        <w:t xml:space="preserve"> HS hệ thống lại kiến thức của bài bằng sơ đồ tư duy; tự đánh giá mức độ đạt yêu cầu cần đạt qua câu hỏi trắc nghiệm; biết bài học của tiết sau. Sử dụng hệ thống luyện tập trực tuyến do giáo viên/tổ chuyên môn tổ chức để củng cố nội dung bài học, nhận phản hồi và tự đánh giá kết quả; thực hiện đúng quy tắc an toàn, bảo mật và trung thực trong môi trường số (5.2.NC1b; 2.5.NC1a).</w:t>
       </w:r>
     </w:p>
     <w:p>

</xml_diff>